<commit_message>
Updated research paper with final corrections
</commit_message>
<xml_diff>
--- a/research-paper/Final_Research_Paper.docx
+++ b/research-paper/Final_Research_Paper.docx
@@ -311,7 +311,6 @@
         </w:rPr>
         <w:t xml:space="preserve"> </w:t>
       </w:r>
-      <w:proofErr w:type="spellStart"/>
       <w:r>
         <w:rPr>
           <w:i/>
@@ -326,7 +325,6 @@
         </w:rPr>
         <w:t>ing</w:t>
       </w:r>
-      <w:proofErr w:type="spellEnd"/>
       <w:r>
         <w:rPr>
           <w:i/>
@@ -359,7 +357,6 @@
         </w:rPr>
         <w:t xml:space="preserve">One of the major challenges in hospital management is </w:t>
       </w:r>
-      <w:proofErr w:type="spellStart"/>
       <w:r>
         <w:rPr>
           <w:i/>
@@ -367,7 +364,6 @@
         </w:rPr>
         <w:t>analyzing</w:t>
       </w:r>
-      <w:proofErr w:type="spellEnd"/>
       <w:r>
         <w:rPr>
           <w:i/>
@@ -423,15 +419,7 @@
           <w:i/>
           <w:iCs/>
         </w:rPr>
-        <w:t xml:space="preserve">In this study, hospital patient data is </w:t>
-      </w:r>
-      <w:proofErr w:type="spellStart"/>
-      <w:r>
-        <w:rPr>
-          <w:i/>
-          <w:iCs/>
-        </w:rPr>
-        <w:t>ana</w:t>
+        <w:t>In this study, hospital patient data is ana</w:t>
       </w:r>
       <w:r>
         <w:rPr>
@@ -440,7 +428,6 @@
         </w:rPr>
         <w:t>lyzed</w:t>
       </w:r>
-      <w:proofErr w:type="spellEnd"/>
       <w:r>
         <w:rPr>
           <w:i/>
@@ -1287,7 +1274,21 @@
           <w:i/>
           <w:iCs/>
         </w:rPr>
-        <w:t>The most common health conditions were analyzed to identify disease patterns. The results show that “Unknown” and “Other” categories have the highest frequency, followed by conditions such as high blood pressure and diabetes</w:t>
+        <w:t xml:space="preserve">The most common health conditions were analyzed to identify disease patterns. </w:t>
+      </w:r>
+      <w:r>
+        <w:rPr>
+          <w:i/>
+          <w:iCs/>
+        </w:rPr>
+        <w:t>The results show that “Unknown” and “Other” categories have the highest frequency, indicating missing or unspecified medical records in the dataset</w:t>
+      </w:r>
+      <w:r>
+        <w:rPr>
+          <w:i/>
+          <w:iCs/>
+        </w:rPr>
+        <w:t>, followed by conditions such as high blood pressure and diabetes</w:t>
       </w:r>
       <w:r>
         <w:t>.</w:t>
@@ -1444,17 +1445,8 @@
           <w:i/>
           <w:iCs/>
         </w:rPr>
-        <w:t xml:space="preserve">The distribution of hospital </w:t>
-      </w:r>
-      <w:proofErr w:type="gramStart"/>
-      <w:r>
-        <w:rPr>
-          <w:i/>
-          <w:iCs/>
-        </w:rPr>
-        <w:t>stay</w:t>
-      </w:r>
-      <w:proofErr w:type="gramEnd"/>
+        <w:t>The distribution of hospital stay</w:t>
+      </w:r>
       <w:r>
         <w:rPr>
           <w:i/>
@@ -1564,7 +1556,7 @@
           <w:noProof/>
         </w:rPr>
         <w:drawing>
-          <wp:inline distT="0" distB="0" distL="0" distR="0" wp14:anchorId="695BA19E" wp14:editId="40ECD977">
+          <wp:inline distT="0" distB="0" distL="0" distR="0" wp14:anchorId="695BA19E" wp14:editId="7A103F57">
             <wp:extent cx="2728913" cy="2513561"/>
             <wp:effectExtent l="0" t="0" r="0" b="1270"/>
             <wp:docPr id="563467481" name="Picture 9"/>
@@ -1848,29 +1840,7 @@
           <w:spacing w:val="-1"/>
           <w:lang w:val="x-none" w:eastAsia="x-none"/>
         </w:rPr>
-        <w:t>Before training, the dataset was pre</w:t>
-      </w:r>
-      <w:r>
-        <w:rPr>
-          <w:i/>
-          <w:iCs/>
-          <w:smallCaps w:val="0"/>
-          <w:noProof w:val="0"/>
-          <w:spacing w:val="-1"/>
-          <w:lang w:val="x-none" w:eastAsia="x-none"/>
-        </w:rPr>
-        <w:t>-</w:t>
-      </w:r>
-      <w:r>
-        <w:rPr>
-          <w:i/>
-          <w:iCs/>
-          <w:smallCaps w:val="0"/>
-          <w:noProof w:val="0"/>
-          <w:spacing w:val="-1"/>
-          <w:lang w:val="x-none" w:eastAsia="x-none"/>
-        </w:rPr>
-        <w:t>processed by encoding categorical variables into numerical form. The dataset was then divided into training and testing sets to evaluate the model’s performance on unseen data.</w:t>
+        <w:t>Before training, the dataset was pre-processed by encoding categorical variables into numerical form. The dataset was then divided into training and testing sets to evaluate the model’s performance on unseen data.</w:t>
       </w:r>
     </w:p>
     <w:p>
@@ -4329,6 +4299,7 @@
   <w:style w:type="character" w:default="1" w:styleId="DefaultParagraphFont">
     <w:name w:val="Default Paragraph Font"/>
     <w:uiPriority w:val="1"/>
+    <w:semiHidden/>
     <w:unhideWhenUsed/>
   </w:style>
   <w:style w:type="table" w:default="1" w:styleId="TableNormal">

</xml_diff>

<commit_message>
Updated Project File and RP
</commit_message>
<xml_diff>
--- a/research-paper/Final_Research_Paper.docx
+++ b/research-paper/Final_Research_Paper.docx
@@ -108,6 +108,75 @@
       <w:pPr>
         <w:pStyle w:val="Author"/>
         <w:spacing w:before="100" w:beforeAutospacing="1"/>
+        <w:rPr>
+          <w:sz w:val="18"/>
+          <w:szCs w:val="18"/>
+        </w:rPr>
+      </w:pPr>
+      <w:r>
+        <w:rPr>
+          <w:sz w:val="18"/>
+          <w:szCs w:val="18"/>
+        </w:rPr>
+        <w:t>Under the guidance of</w:t>
+      </w:r>
+      <w:r>
+        <w:rPr>
+          <w:sz w:val="18"/>
+          <w:szCs w:val="18"/>
+        </w:rPr>
+        <w:t xml:space="preserve"> :</w:t>
+      </w:r>
+      <w:r>
+        <w:rPr>
+          <w:sz w:val="18"/>
+          <w:szCs w:val="18"/>
+        </w:rPr>
+        <w:t xml:space="preserve"> </w:t>
+      </w:r>
+      <w:r>
+        <w:rPr>
+          <w:sz w:val="18"/>
+          <w:szCs w:val="18"/>
+        </w:rPr>
+        <w:br/>
+      </w:r>
+      <w:r>
+        <w:rPr>
+          <w:sz w:val="18"/>
+          <w:szCs w:val="18"/>
+        </w:rPr>
+        <w:t>Veerpal Kau</w:t>
+      </w:r>
+      <w:r>
+        <w:rPr>
+          <w:sz w:val="18"/>
+          <w:szCs w:val="18"/>
+        </w:rPr>
+        <w:t>r (</w:t>
+      </w:r>
+      <w:hyperlink r:id="rId9" w:history="1">
+        <w:r>
+          <w:rPr>
+            <w:rStyle w:val="Hyperlink"/>
+            <w:sz w:val="18"/>
+            <w:szCs w:val="18"/>
+          </w:rPr>
+          <w:t>khaira.veerpal@gmail.com</w:t>
+        </w:r>
+      </w:hyperlink>
+      <w:r>
+        <w:rPr>
+          <w:sz w:val="18"/>
+          <w:szCs w:val="18"/>
+        </w:rPr>
+        <w:t>)</w:t>
+      </w:r>
+    </w:p>
+    <w:p>
+      <w:pPr>
+        <w:pStyle w:val="Author"/>
+        <w:spacing w:before="100" w:beforeAutospacing="1"/>
       </w:pPr>
       <w:r>
         <w:rPr>
@@ -311,6 +380,7 @@
         </w:rPr>
         <w:t xml:space="preserve"> </w:t>
       </w:r>
+      <w:proofErr w:type="spellStart"/>
       <w:r>
         <w:rPr>
           <w:i/>
@@ -325,6 +395,7 @@
         </w:rPr>
         <w:t>ing</w:t>
       </w:r>
+      <w:proofErr w:type="spellEnd"/>
       <w:r>
         <w:rPr>
           <w:i/>
@@ -357,6 +428,7 @@
         </w:rPr>
         <w:t xml:space="preserve">One of the major challenges in hospital management is </w:t>
       </w:r>
+      <w:proofErr w:type="spellStart"/>
       <w:r>
         <w:rPr>
           <w:i/>
@@ -364,12 +436,20 @@
         </w:rPr>
         <w:t>analyzing</w:t>
       </w:r>
-      <w:r>
-        <w:rPr>
-          <w:i/>
-          <w:iCs/>
-        </w:rPr>
-        <w:t xml:space="preserve"> patient admission trends and identifying factors that influence the duration of hospital stay. Variables such as age, gender, type of admission, and severity of illness play a significant role in determining patient outcomes and hospital workload. Understanding these relationships helps in identifying high-risk groups and improving operational efficiency.</w:t>
+      <w:proofErr w:type="spellEnd"/>
+      <w:r>
+        <w:rPr>
+          <w:i/>
+          <w:iCs/>
+        </w:rPr>
+        <w:t xml:space="preserve"> patient admission trends and identifying factors that influence the duration of hospital stay. Variables such as age, gender, type of admission, and severity of illness play a </w:t>
+      </w:r>
+      <w:r>
+        <w:rPr>
+          <w:i/>
+          <w:iCs/>
+        </w:rPr>
+        <w:t>significant role in determining patient outcomes and hospital workload. Understanding these relationships helps in identifying high-risk groups and improving operational efficiency.</w:t>
       </w:r>
     </w:p>
     <w:p>
@@ -419,7 +499,15 @@
           <w:i/>
           <w:iCs/>
         </w:rPr>
-        <w:t>In this study, hospital patient data is ana</w:t>
+        <w:t xml:space="preserve">In this study, hospital patient data is </w:t>
+      </w:r>
+      <w:proofErr w:type="spellStart"/>
+      <w:r>
+        <w:rPr>
+          <w:i/>
+          <w:iCs/>
+        </w:rPr>
+        <w:t>ana</w:t>
       </w:r>
       <w:r>
         <w:rPr>
@@ -428,6 +516,7 @@
         </w:rPr>
         <w:t>lyzed</w:t>
       </w:r>
+      <w:proofErr w:type="spellEnd"/>
       <w:r>
         <w:rPr>
           <w:i/>
@@ -582,6 +671,7 @@
           <w:spacing w:val="0"/>
           <w:lang w:val="en-US" w:eastAsia="en-US"/>
         </w:rPr>
+        <w:lastRenderedPageBreak/>
         <w:t>Some advanced approaches have also used deep learning models, including convolutional and recurrent neural networks, to improve prediction accuracy. These models are capable of handling large and complex datasets, although they require higher computational resources [3].</w:t>
       </w:r>
     </w:p>
@@ -616,18 +706,7 @@
           <w:spacing w:val="0"/>
           <w:lang w:val="en-US" w:eastAsia="en-US"/>
         </w:rPr>
-        <w:t xml:space="preserve">In addition to predictive modeling, several studies have emphasized the importance of exploratory data analysis in </w:t>
-      </w:r>
-      <w:r>
-        <w:rPr>
-          <w:i/>
-          <w:iCs/>
-          <w:noProof/>
-          <w:spacing w:val="0"/>
-          <w:lang w:val="en-US" w:eastAsia="en-US"/>
-        </w:rPr>
-        <w:lastRenderedPageBreak/>
-        <w:t>understanding factors that influence hospital stay. Variables such as patient age, severity of illness, and type of admission have been identified as key factors affecting patient outcomes and hospital workload [4].</w:t>
+        <w:t>In addition to predictive modeling, several studies have emphasized the importance of exploratory data analysis in understanding factors that influence hospital stay. Variables such as patient age, severity of illness, and type of admission have been identified as key factors affecting patient outcomes and hospital workload [4].</w:t>
       </w:r>
     </w:p>
     <w:p>
@@ -820,7 +899,6 @@
         <w:t>The methodology of this study consists of multiple stages, including data preprocessing, exploratory data analysis, and machine learning implementation. The overall workflow is designed to extract meaningful insights from the dataset and build a predictive model based on patient and hospital attributes.</w:t>
       </w:r>
     </w:p>
-    <w:p/>
     <w:p>
       <w:pPr>
         <w:pStyle w:val="Heading4"/>
@@ -893,10 +971,10 @@
         <w:t>This structured approach ensures that both data analysis and predictive modeling are effectively integrated to achieve the objectives of the study.</w:t>
       </w:r>
     </w:p>
-    <w:p/>
     <w:p>
       <w:pPr>
         <w:pStyle w:val="Heading5"/>
+        <w:jc w:val="both"/>
       </w:pPr>
     </w:p>
     <w:p>
@@ -991,7 +1069,7 @@
                     <pic:cNvPicPr/>
                   </pic:nvPicPr>
                   <pic:blipFill>
-                    <a:blip r:embed="rId9">
+                    <a:blip r:embed="rId10">
                       <a:extLst>
                         <a:ext uri="{28A0092B-C50C-407E-A947-70E740481C1C}">
                           <a14:useLocalDpi xmlns:a14="http://schemas.microsoft.com/office/drawing/2010/main" val="0"/>
@@ -1028,10 +1106,8 @@
     <w:p/>
     <w:p/>
     <w:p/>
-    <w:p/>
-    <w:p>
-      <w:r>
-        <w:lastRenderedPageBreak/>
+    <w:p>
+      <w:r>
         <w:t>B. Gender Distribution</w:t>
       </w:r>
     </w:p>
@@ -1073,7 +1149,7 @@
                     <pic:cNvPicPr/>
                   </pic:nvPicPr>
                   <pic:blipFill>
-                    <a:blip r:embed="rId10">
+                    <a:blip r:embed="rId11">
                       <a:extLst>
                         <a:ext uri="{28A0092B-C50C-407E-A947-70E740481C1C}">
                           <a14:useLocalDpi xmlns:a14="http://schemas.microsoft.com/office/drawing/2010/main" val="0"/>
@@ -1150,7 +1226,7 @@
                     <pic:cNvPicPr/>
                   </pic:nvPicPr>
                   <pic:blipFill>
-                    <a:blip r:embed="rId11">
+                    <a:blip r:embed="rId12">
                       <a:extLst>
                         <a:ext uri="{28A0092B-C50C-407E-A947-70E740481C1C}">
                           <a14:useLocalDpi xmlns:a14="http://schemas.microsoft.com/office/drawing/2010/main" val="0"/>
@@ -1229,7 +1305,7 @@
                     <pic:cNvPicPr/>
                   </pic:nvPicPr>
                   <pic:blipFill>
-                    <a:blip r:embed="rId12" cstate="print">
+                    <a:blip r:embed="rId13" cstate="print">
                       <a:extLst>
                         <a:ext uri="{28A0092B-C50C-407E-A947-70E740481C1C}">
                           <a14:useLocalDpi xmlns:a14="http://schemas.microsoft.com/office/drawing/2010/main" val="0"/>
@@ -1316,7 +1392,7 @@
                     <pic:cNvPicPr/>
                   </pic:nvPicPr>
                   <pic:blipFill>
-                    <a:blip r:embed="rId13" cstate="print">
+                    <a:blip r:embed="rId14" cstate="print">
                       <a:extLst>
                         <a:ext uri="{28A0092B-C50C-407E-A947-70E740481C1C}">
                           <a14:useLocalDpi xmlns:a14="http://schemas.microsoft.com/office/drawing/2010/main" val="0"/>
@@ -1349,15 +1425,9 @@
       </w:r>
     </w:p>
     <w:p/>
-    <w:p/>
-    <w:p/>
-    <w:p/>
-    <w:p/>
-    <w:p/>
-    <w:p/>
-    <w:p/>
-    <w:p>
-      <w:r>
+    <w:p>
+      <w:r>
+        <w:lastRenderedPageBreak/>
         <w:t>F. Disease vs Gender</w:t>
       </w:r>
     </w:p>
@@ -1399,7 +1469,7 @@
                     <pic:cNvPicPr/>
                   </pic:nvPicPr>
                   <pic:blipFill>
-                    <a:blip r:embed="rId14" cstate="print">
+                    <a:blip r:embed="rId15" cstate="print">
                       <a:extLst>
                         <a:ext uri="{28A0092B-C50C-407E-A947-70E740481C1C}">
                           <a14:useLocalDpi xmlns:a14="http://schemas.microsoft.com/office/drawing/2010/main" val="0"/>
@@ -1445,8 +1515,17 @@
           <w:i/>
           <w:iCs/>
         </w:rPr>
-        <w:t>The distribution of hospital stay</w:t>
-      </w:r>
+        <w:t xml:space="preserve">The distribution of hospital </w:t>
+      </w:r>
+      <w:proofErr w:type="gramStart"/>
+      <w:r>
+        <w:rPr>
+          <w:i/>
+          <w:iCs/>
+        </w:rPr>
+        <w:t>stay</w:t>
+      </w:r>
+      <w:proofErr w:type="gramEnd"/>
       <w:r>
         <w:rPr>
           <w:i/>
@@ -1487,7 +1566,7 @@
                     <pic:cNvPicPr/>
                   </pic:nvPicPr>
                   <pic:blipFill>
-                    <a:blip r:embed="rId15" cstate="print">
+                    <a:blip r:embed="rId16" cstate="print">
                       <a:extLst>
                         <a:ext uri="{28A0092B-C50C-407E-A947-70E740481C1C}">
                           <a14:useLocalDpi xmlns:a14="http://schemas.microsoft.com/office/drawing/2010/main" val="0"/>
@@ -1556,7 +1635,7 @@
           <w:noProof/>
         </w:rPr>
         <w:drawing>
-          <wp:inline distT="0" distB="0" distL="0" distR="0" wp14:anchorId="695BA19E" wp14:editId="7A103F57">
+          <wp:inline distT="0" distB="0" distL="0" distR="0" wp14:anchorId="695BA19E" wp14:editId="47808184">
             <wp:extent cx="2728913" cy="2513561"/>
             <wp:effectExtent l="0" t="0" r="0" b="1270"/>
             <wp:docPr id="563467481" name="Picture 9"/>
@@ -1571,7 +1650,7 @@
                     <pic:cNvPicPr/>
                   </pic:nvPicPr>
                   <pic:blipFill>
-                    <a:blip r:embed="rId16" cstate="print">
+                    <a:blip r:embed="rId17" cstate="print">
                       <a:extLst>
                         <a:ext uri="{28A0092B-C50C-407E-A947-70E740481C1C}">
                           <a14:useLocalDpi xmlns:a14="http://schemas.microsoft.com/office/drawing/2010/main" val="0"/>
@@ -1637,7 +1716,7 @@
                     <pic:cNvPicPr/>
                   </pic:nvPicPr>
                   <pic:blipFill>
-                    <a:blip r:embed="rId17" cstate="print">
+                    <a:blip r:embed="rId18" cstate="print">
                       <a:extLst>
                         <a:ext uri="{28A0092B-C50C-407E-A947-70E740481C1C}">
                           <a14:useLocalDpi xmlns:a14="http://schemas.microsoft.com/office/drawing/2010/main" val="0"/>
@@ -1676,6 +1755,7 @@
     <w:p/>
     <w:p>
       <w:r>
+        <w:lastRenderedPageBreak/>
         <w:t>J. Machine Learning Insight</w:t>
       </w:r>
     </w:p>
@@ -2281,7 +2361,7 @@
       <w:r>
         <w:t xml:space="preserve">[4] Dataset: “healthcare_data,” Hugging Face Repository, Available: </w:t>
       </w:r>
-      <w:hyperlink r:id="rId18" w:history="1">
+      <w:hyperlink r:id="rId19" w:history="1">
         <w:r>
           <w:rPr>
             <w:rStyle w:val="Hyperlink"/>

</xml_diff>